<commit_message>
Translate table and figure content into English
Translate all Turkish text inside Tables.docx (row/column headers,
category labels, footnote) and figures.docx (chart titles, series and
category labels, plus the embedded Excel data sheets). Also convert
Turkish percent notation (%22.2) to English style (22.2%).

Co-Authored-By: Claude Opus 5 <noreply@anthropic.com>
Claude-Session: https://claude.ai/code/session_01Mpw7AwaSorbAsPprYe4qsw
</commit_message>
<xml_diff>
--- a/Tables.docx
+++ b/Tables.docx
@@ -97,7 +97,7 @@
                 <w:sz w:val="24"/>
                 <w:szCs w:val="24"/>
               </w:rPr>
-              <w:t>Özellik</w:t>
+              <w:t>Characteristic</w:t>
             </w:r>
           </w:p>
         </w:tc>
@@ -164,7 +164,7 @@
                 <w:sz w:val="24"/>
                 <w:szCs w:val="24"/>
               </w:rPr>
-              <w:t>Cinsiyet (% (n))</w:t>
+              <w:t>Sex (% (n))</w:t>
             </w:r>
           </w:p>
           <w:p>
@@ -188,7 +188,7 @@
                 <w:sz w:val="24"/>
                 <w:szCs w:val="24"/>
               </w:rPr>
-              <w:t>Kadın</w:t>
+              <w:t>Female</w:t>
             </w:r>
           </w:p>
           <w:p>
@@ -212,7 +212,7 @@
                 <w:sz w:val="24"/>
                 <w:szCs w:val="24"/>
               </w:rPr>
-              <w:t>Erkek</w:t>
+              <w:t>Male</w:t>
             </w:r>
           </w:p>
         </w:tc>
@@ -327,7 +327,7 @@
                 <w:sz w:val="24"/>
                 <w:szCs w:val="24"/>
               </w:rPr>
-              <w:t>Yaş (ort ± SS)</w:t>
+              <w:t>Age (mean ± SD)</w:t>
             </w:r>
           </w:p>
         </w:tc>
@@ -395,7 +395,7 @@
                 <w:sz w:val="24"/>
                 <w:szCs w:val="24"/>
               </w:rPr>
-              <w:t>Vücut ağırlığı (ort ± SS)</w:t>
+              <w:t>Body weight (mean ± SD)</w:t>
             </w:r>
           </w:p>
         </w:tc>
@@ -463,7 +463,7 @@
                 <w:sz w:val="24"/>
                 <w:szCs w:val="24"/>
               </w:rPr>
-              <w:t>Boy (ort ± SS)</w:t>
+              <w:t>Height (mean ± SD)</w:t>
             </w:r>
           </w:p>
         </w:tc>
@@ -531,7 +531,7 @@
                 <w:sz w:val="24"/>
                 <w:szCs w:val="24"/>
               </w:rPr>
-              <w:t>VKİ (ort ± SS)</w:t>
+              <w:t>BMI (mean ± SD)</w:t>
             </w:r>
           </w:p>
         </w:tc>
@@ -696,7 +696,7 @@
               <w:rPr>
                 <w:rFonts w:ascii="Times New Roman" w:hAnsi="Times New Roman" w:cs="Times New Roman"/>
               </w:rPr>
-              <w:t>Mallampati Skoru</w:t>
+              <w:t>Mallampati score</w:t>
             </w:r>
           </w:p>
         </w:tc>
@@ -719,7 +719,7 @@
               <w:rPr>
                 <w:rFonts w:ascii="Times New Roman" w:hAnsi="Times New Roman" w:cs="Times New Roman"/>
               </w:rPr>
-              <w:t>Zor maske ventilasyonu olan</w:t>
+              <w:t>Difficult mask ventilation present</w:t>
             </w:r>
           </w:p>
         </w:tc>
@@ -739,7 +739,7 @@
               <w:rPr>
                 <w:rFonts w:ascii="Times New Roman" w:hAnsi="Times New Roman" w:cs="Times New Roman"/>
               </w:rPr>
-              <w:t>Zor maske ventilasyonu olmayan</w:t>
+              <w:t>Difficult mask ventilation absent</w:t>
             </w:r>
           </w:p>
         </w:tc>
@@ -879,7 +879,7 @@
                 <w:b/>
                 <w:bCs/>
               </w:rPr>
-              <w:t>Toplam</w:t>
+              <w:t>Total</w:t>
             </w:r>
           </w:p>
         </w:tc>
@@ -1102,7 +1102,7 @@
               <w:rPr>
                 <w:rFonts w:ascii="Times New Roman" w:hAnsi="Times New Roman" w:cs="Times New Roman"/>
               </w:rPr>
-              <w:t>7 (%13.2)</w:t>
+              <w:t>7 (13.2%)</w:t>
             </w:r>
           </w:p>
         </w:tc>
@@ -1127,7 +1127,7 @@
               <w:rPr>
                 <w:rFonts w:ascii="Times New Roman" w:hAnsi="Times New Roman" w:cs="Times New Roman"/>
               </w:rPr>
-              <w:t>46 (%86.8)</w:t>
+              <w:t>46 (86.8%)</w:t>
             </w:r>
           </w:p>
         </w:tc>
@@ -1412,7 +1412,7 @@
               <w:rPr>
                 <w:rFonts w:ascii="Times New Roman" w:hAnsi="Times New Roman" w:cs="Times New Roman"/>
               </w:rPr>
-              <w:t>24  (%12.0)</w:t>
+              <w:t>24  (12.0%)</w:t>
             </w:r>
           </w:p>
         </w:tc>
@@ -1434,7 +1434,7 @@
               <w:rPr>
                 <w:rFonts w:ascii="Times New Roman" w:hAnsi="Times New Roman" w:cs="Times New Roman"/>
               </w:rPr>
-              <w:t>176  (%88)</w:t>
+              <w:t>176  (88%)</w:t>
             </w:r>
           </w:p>
         </w:tc>
@@ -1624,7 +1624,7 @@
               <w:rPr>
                 <w:rFonts w:ascii="Times New Roman" w:hAnsi="Times New Roman" w:cs="Times New Roman"/>
               </w:rPr>
-              <w:t>42 (%44.2)</w:t>
+              <w:t>42 (44.2%)</w:t>
             </w:r>
           </w:p>
         </w:tc>
@@ -1646,7 +1646,7 @@
               <w:rPr>
                 <w:rFonts w:ascii="Times New Roman" w:hAnsi="Times New Roman" w:cs="Times New Roman"/>
               </w:rPr>
-              <w:t>53 (%55.8)</w:t>
+              <w:t>53 (55.8%)</w:t>
             </w:r>
           </w:p>
         </w:tc>
@@ -1836,7 +1836,7 @@
               <w:rPr>
                 <w:rFonts w:ascii="Times New Roman" w:hAnsi="Times New Roman" w:cs="Times New Roman"/>
               </w:rPr>
-              <w:t>10 (%71.4)</w:t>
+              <w:t>10 (71.4%)</w:t>
             </w:r>
           </w:p>
         </w:tc>
@@ -1858,7 +1858,7 @@
               <w:rPr>
                 <w:rFonts w:ascii="Times New Roman" w:hAnsi="Times New Roman" w:cs="Times New Roman"/>
               </w:rPr>
-              <w:t>4 (%28.6)</w:t>
+              <w:t>4 (28.6%)</w:t>
             </w:r>
           </w:p>
         </w:tc>
@@ -2024,7 +2024,7 @@
                 <w:b/>
                 <w:bCs/>
               </w:rPr>
-              <w:t>Toplam</w:t>
+              <w:t>Total</w:t>
             </w:r>
           </w:p>
         </w:tc>
@@ -2049,7 +2049,7 @@
               <w:rPr>
                 <w:rFonts w:ascii="Times New Roman" w:hAnsi="Times New Roman" w:cs="Times New Roman"/>
               </w:rPr>
-              <w:t>83 (%22.9)</w:t>
+              <w:t>83 (22.9%)</w:t>
             </w:r>
           </w:p>
         </w:tc>
@@ -2071,7 +2071,7 @@
               <w:rPr>
                 <w:rFonts w:ascii="Times New Roman" w:hAnsi="Times New Roman" w:cs="Times New Roman"/>
               </w:rPr>
-              <w:t>279 (%77.1)</w:t>
+              <w:t>279 (77.1%)</w:t>
             </w:r>
           </w:p>
         </w:tc>
@@ -2246,7 +2246,7 @@
           <w:szCs w:val="20"/>
           <w14:ligatures w14:val="none"/>
         </w:rPr>
-        <w:t>p₁ değeri Mallampati skoru I ve II olan hastaların, p₂ değeri Mallampati skoru I ve III olan hastaların, p₃ değeri Mallampati skoru I ve IV olan hastaların, p₄ değeri Mallampati skoru II ve III olan hastaların, p₅ değeri Mallampati skoru II ve IV olan hastaların, p₆ değeri ise Mallampati skoru III ve IV olan hastaların zor maske ventilasyonu açısından karşılaştırılması ile elde edilmiştir.</w:t>
+        <w:t>p₁ denotes the comparison of patients with Mallampati score I versus II, p₂ score I versus III, p₃ score I versus IV, p₄ score II versus III, p₅ score II versus IV, and p₆ score III versus IV, with respect to difficult mask ventilation.</w:t>
       </w:r>
     </w:p>
     <w:p>
@@ -2377,7 +2377,7 @@
               <w:rPr>
                 <w:rFonts w:ascii="Times New Roman" w:hAnsi="Times New Roman" w:cs="Times New Roman"/>
               </w:rPr>
-              <w:t>Endotrakeal  Entübasyon</w:t>
+              <w:t>Endotracheal intubation</w:t>
             </w:r>
           </w:p>
         </w:tc>
@@ -2434,7 +2434,7 @@
                 <w:b/>
                 <w:bCs/>
               </w:rPr>
-              <w:t>Zor</w:t>
+              <w:t>Difficult</w:t>
             </w:r>
           </w:p>
         </w:tc>
@@ -2462,7 +2462,7 @@
                 <w:b/>
                 <w:bCs/>
               </w:rPr>
-              <w:t>Kolay</w:t>
+              <w:t>Easy</w:t>
             </w:r>
           </w:p>
         </w:tc>
@@ -2493,7 +2493,7 @@
                 <w:b/>
                 <w:bCs/>
               </w:rPr>
-              <w:t>p değeri</w:t>
+              <w:t>p value</w:t>
             </w:r>
           </w:p>
         </w:tc>
@@ -2529,25 +2529,25 @@
                 <w:b/>
                 <w:bCs/>
               </w:rPr>
-              <w:t>Ortalama</w:t>
-            </w:r>
-          </w:p>
-          <w:p>
-            <w:pPr>
-              <w:jc w:val="center"/>
-              <w:rPr>
-                <w:rFonts w:ascii="Times New Roman" w:hAnsi="Times New Roman" w:cs="Times New Roman"/>
-                <w:b/>
-                <w:bCs/>
-              </w:rPr>
-            </w:pPr>
-            <w:r>
-              <w:rPr>
-                <w:rFonts w:ascii="Times New Roman" w:hAnsi="Times New Roman" w:cs="Times New Roman"/>
-                <w:b/>
-                <w:bCs/>
-              </w:rPr>
-              <w:t>Vücut Ağırlığı</w:t>
+              <w:t>Mean</w:t>
+            </w:r>
+          </w:p>
+          <w:p>
+            <w:pPr>
+              <w:jc w:val="center"/>
+              <w:rPr>
+                <w:rFonts w:ascii="Times New Roman" w:hAnsi="Times New Roman" w:cs="Times New Roman"/>
+                <w:b/>
+                <w:bCs/>
+              </w:rPr>
+            </w:pPr>
+            <w:r>
+              <w:rPr>
+                <w:rFonts w:ascii="Times New Roman" w:hAnsi="Times New Roman" w:cs="Times New Roman"/>
+                <w:b/>
+                <w:bCs/>
+              </w:rPr>
+              <w:t>body weight</w:t>
             </w:r>
           </w:p>
           <w:p>
@@ -2683,25 +2683,25 @@
                 <w:b/>
                 <w:bCs/>
               </w:rPr>
-              <w:t>Ortalama</w:t>
-            </w:r>
-          </w:p>
-          <w:p>
-            <w:pPr>
-              <w:jc w:val="center"/>
-              <w:rPr>
-                <w:rFonts w:ascii="Times New Roman" w:hAnsi="Times New Roman" w:cs="Times New Roman"/>
-                <w:b/>
-                <w:bCs/>
-              </w:rPr>
-            </w:pPr>
-            <w:r>
-              <w:rPr>
-                <w:rFonts w:ascii="Times New Roman" w:hAnsi="Times New Roman" w:cs="Times New Roman"/>
-                <w:b/>
-                <w:bCs/>
-              </w:rPr>
-              <w:t>VKİ</w:t>
+              <w:t>Mean</w:t>
+            </w:r>
+          </w:p>
+          <w:p>
+            <w:pPr>
+              <w:jc w:val="center"/>
+              <w:rPr>
+                <w:rFonts w:ascii="Times New Roman" w:hAnsi="Times New Roman" w:cs="Times New Roman"/>
+                <w:b/>
+                <w:bCs/>
+              </w:rPr>
+            </w:pPr>
+            <w:r>
+              <w:rPr>
+                <w:rFonts w:ascii="Times New Roman" w:hAnsi="Times New Roman" w:cs="Times New Roman"/>
+                <w:b/>
+                <w:bCs/>
+              </w:rPr>
+              <w:t>BMI</w:t>
             </w:r>
           </w:p>
           <w:p>
@@ -2911,7 +2911,7 @@
               <w:rPr>
                 <w:rFonts w:ascii="Times New Roman" w:hAnsi="Times New Roman" w:cs="Times New Roman"/>
               </w:rPr>
-              <w:t>KADIN</w:t>
+              <w:t>FEMALE</w:t>
             </w:r>
           </w:p>
         </w:tc>
@@ -2937,7 +2937,7 @@
               <w:rPr>
                 <w:rFonts w:ascii="Times New Roman" w:hAnsi="Times New Roman" w:cs="Times New Roman"/>
               </w:rPr>
-              <w:t>ERKEK</w:t>
+              <w:t>MALE</w:t>
             </w:r>
           </w:p>
         </w:tc>
@@ -2962,7 +2962,7 @@
               <w:rPr>
                 <w:rFonts w:ascii="Times New Roman" w:hAnsi="Times New Roman" w:cs="Times New Roman"/>
               </w:rPr>
-              <w:t>p değeri</w:t>
+              <w:t>p value</w:t>
             </w:r>
           </w:p>
         </w:tc>
@@ -3022,7 +3022,7 @@
                 <w:b/>
                 <w:bCs/>
               </w:rPr>
-              <w:t>VAR</w:t>
+              <w:t>YES</w:t>
             </w:r>
           </w:p>
         </w:tc>
@@ -3054,7 +3054,7 @@
                 <w:b/>
                 <w:bCs/>
               </w:rPr>
-              <w:t>YOK</w:t>
+              <w:t>NO</w:t>
             </w:r>
           </w:p>
         </w:tc>
@@ -3086,7 +3086,7 @@
                 <w:b/>
                 <w:bCs/>
               </w:rPr>
-              <w:t>VAR</w:t>
+              <w:t>YES</w:t>
             </w:r>
           </w:p>
         </w:tc>
@@ -3118,7 +3118,7 @@
                 <w:b/>
                 <w:bCs/>
               </w:rPr>
-              <w:t>YOK</w:t>
+              <w:t>NO</w:t>
             </w:r>
           </w:p>
         </w:tc>
@@ -3181,24 +3181,24 @@
                 <w:b/>
                 <w:bCs/>
               </w:rPr>
-              <w:t xml:space="preserve">Zor Maske </w:t>
-            </w:r>
-          </w:p>
-          <w:p>
-            <w:pPr>
-              <w:rPr>
-                <w:rFonts w:ascii="Times New Roman" w:hAnsi="Times New Roman" w:cs="Times New Roman"/>
-                <w:b/>
-                <w:bCs/>
-              </w:rPr>
-            </w:pPr>
-            <w:r>
-              <w:rPr>
-                <w:rFonts w:ascii="Times New Roman" w:hAnsi="Times New Roman" w:cs="Times New Roman"/>
-                <w:b/>
-                <w:bCs/>
-              </w:rPr>
-              <w:t>Ventilasyonu</w:t>
+              <w:t xml:space="preserve">Difficult mask </w:t>
+            </w:r>
+          </w:p>
+          <w:p>
+            <w:pPr>
+              <w:rPr>
+                <w:rFonts w:ascii="Times New Roman" w:hAnsi="Times New Roman" w:cs="Times New Roman"/>
+                <w:b/>
+                <w:bCs/>
+              </w:rPr>
+            </w:pPr>
+            <w:r>
+              <w:rPr>
+                <w:rFonts w:ascii="Times New Roman" w:hAnsi="Times New Roman" w:cs="Times New Roman"/>
+                <w:b/>
+                <w:bCs/>
+              </w:rPr>
+              <w:t>ventilation</w:t>
             </w:r>
           </w:p>
         </w:tc>
@@ -3226,7 +3226,7 @@
               <w:rPr>
                 <w:rFonts w:ascii="Times New Roman" w:hAnsi="Times New Roman" w:cs="Times New Roman"/>
               </w:rPr>
-              <w:t>%22.2</w:t>
+              <w:t>22.2%</w:t>
             </w:r>
           </w:p>
           <w:p>
@@ -3271,7 +3271,7 @@
               <w:rPr>
                 <w:rFonts w:ascii="Times New Roman" w:hAnsi="Times New Roman" w:cs="Times New Roman"/>
               </w:rPr>
-              <w:t>% 77.8</w:t>
+              <w:t>77.8%</w:t>
             </w:r>
           </w:p>
           <w:p>
@@ -3316,7 +3316,7 @@
               <w:rPr>
                 <w:rFonts w:ascii="Times New Roman" w:hAnsi="Times New Roman" w:cs="Times New Roman"/>
               </w:rPr>
-              <w:t>%23.7</w:t>
+              <w:t>23.7%</w:t>
             </w:r>
           </w:p>
           <w:p>
@@ -3361,7 +3361,7 @@
               <w:rPr>
                 <w:rFonts w:ascii="Times New Roman" w:hAnsi="Times New Roman" w:cs="Times New Roman"/>
               </w:rPr>
-              <w:t>%76.3</w:t>
+              <w:t>76.3%</w:t>
             </w:r>
           </w:p>
           <w:p>
@@ -3448,7 +3448,7 @@
                 <w:b/>
                 <w:bCs/>
               </w:rPr>
-              <w:t>Zor Endotrakeal Entübasyon</w:t>
+              <w:t>Difficult endotracheal intubation</w:t>
             </w:r>
           </w:p>
         </w:tc>
@@ -3476,7 +3476,7 @@
               <w:rPr>
                 <w:rFonts w:ascii="Times New Roman" w:hAnsi="Times New Roman" w:cs="Times New Roman"/>
               </w:rPr>
-              <w:t>%4.2</w:t>
+              <w:t>4.2%</w:t>
             </w:r>
           </w:p>
           <w:p>
@@ -3521,7 +3521,7 @@
               <w:rPr>
                 <w:rFonts w:ascii="Times New Roman" w:hAnsi="Times New Roman" w:cs="Times New Roman"/>
               </w:rPr>
-              <w:t>%95.8</w:t>
+              <w:t>95.8%</w:t>
             </w:r>
           </w:p>
           <w:p>
@@ -3566,7 +3566,7 @@
               <w:rPr>
                 <w:rFonts w:ascii="Times New Roman" w:hAnsi="Times New Roman" w:cs="Times New Roman"/>
               </w:rPr>
-              <w:t>%10.1</w:t>
+              <w:t>10.1%</w:t>
             </w:r>
           </w:p>
           <w:p>
@@ -3611,7 +3611,7 @@
               <w:rPr>
                 <w:rFonts w:ascii="Times New Roman" w:hAnsi="Times New Roman" w:cs="Times New Roman"/>
               </w:rPr>
-              <w:t>%89.9</w:t>
+              <w:t>89.9%</w:t>
             </w:r>
           </w:p>
           <w:p>
@@ -3701,24 +3701,24 @@
                 <w:b/>
                 <w:bCs/>
               </w:rPr>
-              <w:t xml:space="preserve">İlk Denemede </w:t>
-            </w:r>
-          </w:p>
-          <w:p>
-            <w:pPr>
-              <w:rPr>
-                <w:rFonts w:ascii="Times New Roman" w:hAnsi="Times New Roman" w:cs="Times New Roman"/>
-                <w:b/>
-                <w:bCs/>
-              </w:rPr>
-            </w:pPr>
-            <w:r>
-              <w:rPr>
-                <w:rFonts w:ascii="Times New Roman" w:hAnsi="Times New Roman" w:cs="Times New Roman"/>
-                <w:b/>
-                <w:bCs/>
-              </w:rPr>
-              <w:t>Endotrakeal Entübasyon Başarısı</w:t>
+              <w:t xml:space="preserve">First-attempt </w:t>
+            </w:r>
+          </w:p>
+          <w:p>
+            <w:pPr>
+              <w:rPr>
+                <w:rFonts w:ascii="Times New Roman" w:hAnsi="Times New Roman" w:cs="Times New Roman"/>
+                <w:b/>
+                <w:bCs/>
+              </w:rPr>
+            </w:pPr>
+            <w:r>
+              <w:rPr>
+                <w:rFonts w:ascii="Times New Roman" w:hAnsi="Times New Roman" w:cs="Times New Roman"/>
+                <w:b/>
+                <w:bCs/>
+              </w:rPr>
+              <w:t>endotracheal intubation success</w:t>
             </w:r>
           </w:p>
         </w:tc>
@@ -3745,7 +3745,7 @@
               <w:rPr>
                 <w:rFonts w:ascii="Times New Roman" w:hAnsi="Times New Roman" w:cs="Times New Roman"/>
               </w:rPr>
-              <w:t>%70.1</w:t>
+              <w:t>70.1%</w:t>
             </w:r>
           </w:p>
           <w:p>
@@ -3790,7 +3790,7 @@
               <w:rPr>
                 <w:rFonts w:ascii="Times New Roman" w:hAnsi="Times New Roman" w:cs="Times New Roman"/>
               </w:rPr>
-              <w:t>%29.9</w:t>
+              <w:t>29.9%</w:t>
             </w:r>
           </w:p>
           <w:p>
@@ -3834,7 +3834,7 @@
               <w:rPr>
                 <w:rFonts w:ascii="Times New Roman" w:hAnsi="Times New Roman" w:cs="Times New Roman"/>
               </w:rPr>
-              <w:t>%67.8</w:t>
+              <w:t>67.8%</w:t>
             </w:r>
           </w:p>
           <w:p>
@@ -3879,7 +3879,7 @@
               <w:rPr>
                 <w:rFonts w:ascii="Times New Roman" w:hAnsi="Times New Roman" w:cs="Times New Roman"/>
               </w:rPr>
-              <w:t>%32.2 (n=67)</w:t>
+              <w:t>32.2% (n=67)</w:t>
             </w:r>
           </w:p>
         </w:tc>
@@ -4129,7 +4129,7 @@
               <w:rPr>
                 <w:rFonts w:ascii="Times New Roman" w:hAnsi="Times New Roman" w:cs="Times New Roman"/>
               </w:rPr>
-              <w:t>OSAS TANISI VAR</w:t>
+              <w:t>OSA DIAGNOSIS PRESENT</w:t>
             </w:r>
           </w:p>
         </w:tc>
@@ -4155,7 +4155,7 @@
               <w:rPr>
                 <w:rFonts w:ascii="Times New Roman" w:hAnsi="Times New Roman" w:cs="Times New Roman"/>
               </w:rPr>
-              <w:t>OSAS TANISI YOK</w:t>
+              <w:t>OSA DIAGNOSIS ABSENT</w:t>
             </w:r>
           </w:p>
         </w:tc>
@@ -4180,7 +4180,7 @@
               <w:rPr>
                 <w:rFonts w:ascii="Times New Roman" w:hAnsi="Times New Roman" w:cs="Times New Roman"/>
               </w:rPr>
-              <w:t>p değeri</w:t>
+              <w:t>p value</w:t>
             </w:r>
           </w:p>
         </w:tc>
@@ -4240,7 +4240,7 @@
                 <w:b/>
                 <w:bCs/>
               </w:rPr>
-              <w:t>VAR</w:t>
+              <w:t>YES</w:t>
             </w:r>
           </w:p>
         </w:tc>
@@ -4272,7 +4272,7 @@
                 <w:b/>
                 <w:bCs/>
               </w:rPr>
-              <w:t>YOK</w:t>
+              <w:t>NO</w:t>
             </w:r>
           </w:p>
         </w:tc>
@@ -4304,7 +4304,7 @@
                 <w:b/>
                 <w:bCs/>
               </w:rPr>
-              <w:t>VAR</w:t>
+              <w:t>YES</w:t>
             </w:r>
           </w:p>
         </w:tc>
@@ -4336,7 +4336,7 @@
                 <w:b/>
                 <w:bCs/>
               </w:rPr>
-              <w:t>YOK</w:t>
+              <w:t>NO</w:t>
             </w:r>
           </w:p>
         </w:tc>
@@ -4399,24 +4399,24 @@
                 <w:b/>
                 <w:bCs/>
               </w:rPr>
-              <w:t xml:space="preserve">Zor Maske </w:t>
-            </w:r>
-          </w:p>
-          <w:p>
-            <w:pPr>
-              <w:rPr>
-                <w:rFonts w:ascii="Times New Roman" w:hAnsi="Times New Roman" w:cs="Times New Roman"/>
-                <w:b/>
-                <w:bCs/>
-              </w:rPr>
-            </w:pPr>
-            <w:r>
-              <w:rPr>
-                <w:rFonts w:ascii="Times New Roman" w:hAnsi="Times New Roman" w:cs="Times New Roman"/>
-                <w:b/>
-                <w:bCs/>
-              </w:rPr>
-              <w:t>Ventilasyonu</w:t>
+              <w:t xml:space="preserve">Difficult mask </w:t>
+            </w:r>
+          </w:p>
+          <w:p>
+            <w:pPr>
+              <w:rPr>
+                <w:rFonts w:ascii="Times New Roman" w:hAnsi="Times New Roman" w:cs="Times New Roman"/>
+                <w:b/>
+                <w:bCs/>
+              </w:rPr>
+            </w:pPr>
+            <w:r>
+              <w:rPr>
+                <w:rFonts w:ascii="Times New Roman" w:hAnsi="Times New Roman" w:cs="Times New Roman"/>
+                <w:b/>
+                <w:bCs/>
+              </w:rPr>
+              <w:t>ventilation</w:t>
             </w:r>
           </w:p>
         </w:tc>
@@ -4444,7 +4444,7 @@
               <w:rPr>
                 <w:rFonts w:ascii="Times New Roman" w:hAnsi="Times New Roman" w:cs="Times New Roman"/>
               </w:rPr>
-              <w:t>%78.8</w:t>
+              <w:t>78.8%</w:t>
             </w:r>
           </w:p>
           <w:p>
@@ -4489,7 +4489,7 @@
               <w:rPr>
                 <w:rFonts w:ascii="Times New Roman" w:hAnsi="Times New Roman" w:cs="Times New Roman"/>
               </w:rPr>
-              <w:t>% 21.2</w:t>
+              <w:t>21.2%</w:t>
             </w:r>
           </w:p>
           <w:p>
@@ -4534,7 +4534,7 @@
               <w:rPr>
                 <w:rFonts w:ascii="Times New Roman" w:hAnsi="Times New Roman" w:cs="Times New Roman"/>
               </w:rPr>
-              <w:t>%17.6</w:t>
+              <w:t>17.6%</w:t>
             </w:r>
           </w:p>
           <w:p>
@@ -4579,7 +4579,7 @@
               <w:rPr>
                 <w:rFonts w:ascii="Times New Roman" w:hAnsi="Times New Roman" w:cs="Times New Roman"/>
               </w:rPr>
-              <w:t>%82.4</w:t>
+              <w:t>82.4%</w:t>
             </w:r>
           </w:p>
           <w:p>
@@ -4669,7 +4669,7 @@
                 <w:b/>
                 <w:bCs/>
               </w:rPr>
-              <w:t>Zor Endotrakeal Entübasyon</w:t>
+              <w:t>Difficult endotracheal intubation</w:t>
             </w:r>
           </w:p>
         </w:tc>
@@ -4697,7 +4697,7 @@
               <w:rPr>
                 <w:rFonts w:ascii="Times New Roman" w:hAnsi="Times New Roman" w:cs="Times New Roman"/>
               </w:rPr>
-              <w:t>%27.3</w:t>
+              <w:t>27.3%</w:t>
             </w:r>
           </w:p>
           <w:p>
@@ -4742,7 +4742,7 @@
               <w:rPr>
                 <w:rFonts w:ascii="Times New Roman" w:hAnsi="Times New Roman" w:cs="Times New Roman"/>
               </w:rPr>
-              <w:t>%72.7</w:t>
+              <w:t>72.7%</w:t>
             </w:r>
           </w:p>
           <w:p>
@@ -4787,7 +4787,7 @@
               <w:rPr>
                 <w:rFonts w:ascii="Times New Roman" w:hAnsi="Times New Roman" w:cs="Times New Roman"/>
               </w:rPr>
-              <w:t>%5.6 (n=19)</w:t>
+              <w:t>5.6% (n=19)</w:t>
             </w:r>
           </w:p>
         </w:tc>
@@ -4815,7 +4815,7 @@
               <w:rPr>
                 <w:rFonts w:ascii="Times New Roman" w:hAnsi="Times New Roman" w:cs="Times New Roman"/>
               </w:rPr>
-              <w:t>%94.4 (n=322)</w:t>
+              <w:t>94.4% (n=322)</w:t>
             </w:r>
           </w:p>
         </w:tc>
@@ -4887,24 +4887,24 @@
                 <w:b/>
                 <w:bCs/>
               </w:rPr>
-              <w:t xml:space="preserve">İlk Denemede </w:t>
-            </w:r>
-          </w:p>
-          <w:p>
-            <w:pPr>
-              <w:rPr>
-                <w:rFonts w:ascii="Times New Roman" w:hAnsi="Times New Roman" w:cs="Times New Roman"/>
-                <w:b/>
-                <w:bCs/>
-              </w:rPr>
-            </w:pPr>
-            <w:r>
-              <w:rPr>
-                <w:rFonts w:ascii="Times New Roman" w:hAnsi="Times New Roman" w:cs="Times New Roman"/>
-                <w:b/>
-                <w:bCs/>
-              </w:rPr>
-              <w:t>Endotrakeal Entübasyon Başarısı</w:t>
+              <w:t xml:space="preserve">First-attempt </w:t>
+            </w:r>
+          </w:p>
+          <w:p>
+            <w:pPr>
+              <w:rPr>
+                <w:rFonts w:ascii="Times New Roman" w:hAnsi="Times New Roman" w:cs="Times New Roman"/>
+                <w:b/>
+                <w:bCs/>
+              </w:rPr>
+            </w:pPr>
+            <w:r>
+              <w:rPr>
+                <w:rFonts w:ascii="Times New Roman" w:hAnsi="Times New Roman" w:cs="Times New Roman"/>
+                <w:b/>
+                <w:bCs/>
+              </w:rPr>
+              <w:t>endotracheal intubation success</w:t>
             </w:r>
           </w:p>
         </w:tc>
@@ -4931,7 +4931,7 @@
               <w:rPr>
                 <w:rFonts w:ascii="Times New Roman" w:hAnsi="Times New Roman" w:cs="Times New Roman"/>
               </w:rPr>
-              <w:t>%39.4</w:t>
+              <w:t>39.4%</w:t>
             </w:r>
           </w:p>
           <w:p>
@@ -4976,7 +4976,7 @@
               <w:rPr>
                 <w:rFonts w:ascii="Times New Roman" w:hAnsi="Times New Roman" w:cs="Times New Roman"/>
               </w:rPr>
-              <w:t>%60.6</w:t>
+              <w:t>60.6%</w:t>
             </w:r>
           </w:p>
           <w:p>
@@ -5020,7 +5020,7 @@
               <w:rPr>
                 <w:rFonts w:ascii="Times New Roman" w:hAnsi="Times New Roman" w:cs="Times New Roman"/>
               </w:rPr>
-              <w:t>%71.6 (n=244)</w:t>
+              <w:t>71.6% (n=244)</w:t>
             </w:r>
           </w:p>
         </w:tc>
@@ -5048,7 +5048,7 @@
               <w:rPr>
                 <w:rFonts w:ascii="Times New Roman" w:hAnsi="Times New Roman" w:cs="Times New Roman"/>
               </w:rPr>
-              <w:t>%28.4 (n=97)</w:t>
+              <w:t>28.4% (n=97)</w:t>
             </w:r>
           </w:p>
         </w:tc>
@@ -5242,7 +5242,7 @@
                 <w:sz w:val="20"/>
                 <w:szCs w:val="20"/>
               </w:rPr>
-              <w:t>VİDEOLARİNGOSKOPİ</w:t>
+              <w:t>VIDEOLARYNGOSCOPY</w:t>
             </w:r>
           </w:p>
         </w:tc>
@@ -5271,7 +5271,7 @@
                 <w:sz w:val="20"/>
                 <w:szCs w:val="20"/>
               </w:rPr>
-              <w:t>VİDEOLARİNGOSKOPİ DIŞI YÖNTEM</w:t>
+              <w:t>NON-VIDEOLARYNGOSCOPIC METHOD</w:t>
             </w:r>
           </w:p>
         </w:tc>
@@ -5300,7 +5300,7 @@
                 <w:sz w:val="20"/>
                 <w:szCs w:val="20"/>
               </w:rPr>
-              <w:t>p değeri</w:t>
+              <w:t>p value</w:t>
             </w:r>
           </w:p>
         </w:tc>
@@ -5361,7 +5361,7 @@
                 <w:sz w:val="20"/>
                 <w:szCs w:val="20"/>
               </w:rPr>
-              <w:t>Ortalama ± standart sapma</w:t>
+              <w:t>Mean ± standard deviation</w:t>
             </w:r>
           </w:p>
         </w:tc>
@@ -5429,7 +5429,7 @@
                 <w:sz w:val="20"/>
                 <w:szCs w:val="20"/>
               </w:rPr>
-              <w:t>ORTALAMA YAŞ</w:t>
+              <w:t>MEAN AGE</w:t>
             </w:r>
           </w:p>
         </w:tc>
@@ -5567,7 +5567,7 @@
                 <w:sz w:val="20"/>
                 <w:szCs w:val="20"/>
               </w:rPr>
-              <w:t>ORTALAMA VÜCUT AĞIRLIĞI</w:t>
+              <w:t>MEAN BODY WEIGHT</w:t>
             </w:r>
           </w:p>
           <w:p>
@@ -5729,7 +5729,7 @@
                 <w:sz w:val="20"/>
                 <w:szCs w:val="20"/>
               </w:rPr>
-              <w:t xml:space="preserve">ORTALAMA </w:t>
+              <w:t xml:space="preserve">MEAN </w:t>
             </w:r>
           </w:p>
           <w:p>
@@ -5750,7 +5750,7 @@
                 <w:sz w:val="20"/>
                 <w:szCs w:val="20"/>
               </w:rPr>
-              <w:t>VKİ</w:t>
+              <w:t>BMI</w:t>
             </w:r>
           </w:p>
           <w:p>

</xml_diff>